<commit_message>
docs(final): update the submission report docx to the locally finalized version
- The entry routes are corrected to the HashRouter form: /#/m (buyers) and /#/admin (the console),
  the judges' preferred entry becomes http://115.191.76.40/ (both sides in one frame), and the non-existent /showcase route is removed
- §8 is filled in with the freeze commit 4a4f42f (2026-06-08) plus the matching CI run 27138537500
- Only the demo video link remains to be added after recording

Note: the .md in the same directory is the earlier source and has diverged from this docx (it still has /showcase and a placeholder SHA);
the docx is the final submission artifact, and syncing the .md is TBD.
</commit_message>
<xml_diff>
--- a/docs/final-submission/Lumen-Auction-提交报告.docx
+++ b/docs/final-submission/Lumen-Auction-提交报告.docx
@@ -939,7 +939,7 @@
           <w:sz w:val="21"/>
           <w:szCs w:val="21"/>
         </w:rPr>
-        <w:t xml:space="preserve">22</w:t>
+        <w:t xml:space="preserve">23</w:t>
       </w:r>
     </w:p>
     <w:p>
@@ -986,7 +986,7 @@
           <w:sz w:val="21"/>
           <w:szCs w:val="21"/>
         </w:rPr>
-        <w:t xml:space="preserve">24</w:t>
+        <w:t xml:space="preserve">25</w:t>
       </w:r>
     </w:p>
     <w:p>
@@ -1033,7 +1033,7 @@
           <w:sz w:val="21"/>
           <w:szCs w:val="21"/>
         </w:rPr>
-        <w:t xml:space="preserve">25</w:t>
+        <w:t xml:space="preserve">27</w:t>
       </w:r>
     </w:p>
     <w:p>
@@ -3639,7 +3639,7 @@
           <w:sz w:val="22"/>
           <w:szCs w:val="22"/>
         </w:rPr>
-        <w:t xml:space="preserve">系统已部署于火山引擎北京 ECS，持续交付流水线在主分支通过持续集成后自动部署。下表给出对外可访问的入口与说明。</w:t>
+        <w:t xml:space="preserve">系统已部署于火山引擎北京 ECS，持续交付流水线在主分支通过持续集成后自动部署。经前端重构后，对外的访问路由收敛为三个真实入口：演示入口、PC 管理后台与移动端用户端。下表给出各入口与说明。</w:t>
       </w:r>
     </w:p>
     <w:tbl>
@@ -3656,8 +3656,8 @@
       </w:tblPr>
       <w:tblGrid>
         <w:gridCol w:w="2100"/>
-        <w:gridCol w:w="3500"/>
-        <w:gridCol w:w="3760"/>
+        <w:gridCol w:w="3260"/>
+        <w:gridCol w:w="4000"/>
       </w:tblGrid>
       <w:tr>
         <w:trPr>
@@ -3688,8 +3688,8 @@
                 <w:i w:val="false"/>
                 <w:iCs w:val="false"/>
                 <w:color w:val="000000"/>
-                <w:sz w:val="19"/>
-                <w:szCs w:val="19"/>
+                <w:sz w:val="18"/>
+                <w:szCs w:val="18"/>
               </w:rPr>
               <w:t xml:space="preserve">入口</w:t>
             </w:r>
@@ -3697,7 +3697,7 @@
         </w:tc>
         <w:tc>
           <w:tcPr>
-            <w:tcW w:type="dxa" w:w="3500"/>
+            <w:tcW w:type="dxa" w:w="3260"/>
             <w:shd w:fill="D9E2F3" w:color="auto" w:val="clear"/>
             <w:tcMar>
               <w:top w:type="dxa" w:w="60"/>
@@ -3720,8 +3720,8 @@
                 <w:i w:val="false"/>
                 <w:iCs w:val="false"/>
                 <w:color w:val="000000"/>
-                <w:sz w:val="19"/>
-                <w:szCs w:val="19"/>
+                <w:sz w:val="18"/>
+                <w:szCs w:val="18"/>
               </w:rPr>
               <w:t xml:space="preserve">链接</w:t>
             </w:r>
@@ -3729,7 +3729,7 @@
         </w:tc>
         <w:tc>
           <w:tcPr>
-            <w:tcW w:type="dxa" w:w="3760"/>
+            <w:tcW w:type="dxa" w:w="4000"/>
             <w:shd w:fill="D9E2F3" w:color="auto" w:val="clear"/>
             <w:tcMar>
               <w:top w:type="dxa" w:w="60"/>
@@ -3752,8 +3752,8 @@
                 <w:i w:val="false"/>
                 <w:iCs w:val="false"/>
                 <w:color w:val="000000"/>
-                <w:sz w:val="19"/>
-                <w:szCs w:val="19"/>
+                <w:sz w:val="18"/>
+                <w:szCs w:val="18"/>
               </w:rPr>
               <w:t xml:space="preserve">说明</w:t>
             </w:r>
@@ -3788,72 +3788,72 @@
                 <w:i w:val="false"/>
                 <w:iCs w:val="false"/>
                 <w:color w:val="000000"/>
-                <w:sz w:val="19"/>
-                <w:szCs w:val="19"/>
-              </w:rPr>
-              <w:t xml:space="preserve">生产公网入口</w:t>
-            </w:r>
-          </w:p>
-        </w:tc>
-        <w:tc>
-          <w:tcPr>
-            <w:tcW w:type="dxa" w:w="3500"/>
-            <w:tcMar>
-              <w:top w:type="dxa" w:w="60"/>
-              <w:left w:type="dxa" w:w="110"/>
-              <w:bottom w:type="dxa" w:w="60"/>
-              <w:right w:type="dxa" w:w="110"/>
-            </w:tcMar>
-            <w:vAlign w:val="center"/>
-          </w:tcPr>
-          <w:p>
-            <w:pPr>
-              <w:spacing w:after="0" w:line="270" w:lineRule="auto"/>
-              <w:jc w:val="left"/>
-            </w:pPr>
-            <w:r>
-              <w:rPr>
-                <w:rFonts w:ascii="Arial" w:eastAsia="微软雅黑" w:hAnsi="Arial"/>
-                <w:b w:val="false"/>
-                <w:bCs w:val="false"/>
-                <w:i w:val="false"/>
-                <w:iCs w:val="false"/>
-                <w:color w:val="000000"/>
-                <w:sz w:val="19"/>
-                <w:szCs w:val="19"/>
-              </w:rPr>
-              <w:t xml:space="preserve">http://115.191.76.40</w:t>
-            </w:r>
-          </w:p>
-        </w:tc>
-        <w:tc>
-          <w:tcPr>
-            <w:tcW w:type="dxa" w:w="3760"/>
-            <w:tcMar>
-              <w:top w:type="dxa" w:w="60"/>
-              <w:left w:type="dxa" w:w="110"/>
-              <w:bottom w:type="dxa" w:w="60"/>
-              <w:right w:type="dxa" w:w="110"/>
-            </w:tcMar>
-            <w:vAlign w:val="center"/>
-          </w:tcPr>
-          <w:p>
-            <w:pPr>
-              <w:spacing w:after="0" w:line="270" w:lineRule="auto"/>
-              <w:jc w:val="left"/>
-            </w:pPr>
-            <w:r>
-              <w:rPr>
-                <w:rFonts w:ascii="Arial" w:eastAsia="微软雅黑" w:hAnsi="Arial"/>
-                <w:b w:val="false"/>
-                <w:bCs w:val="false"/>
-                <w:i w:val="false"/>
-                <w:iCs w:val="false"/>
-                <w:color w:val="000000"/>
-                <w:sz w:val="19"/>
-                <w:szCs w:val="19"/>
-              </w:rPr>
-              <w:t xml:space="preserve">自动部署主分支；版本接口返回构建标识</w:t>
+                <w:sz w:val="18"/>
+                <w:szCs w:val="18"/>
+              </w:rPr>
+              <w:t xml:space="preserve">演示入口（评委首选）</w:t>
+            </w:r>
+          </w:p>
+        </w:tc>
+        <w:tc>
+          <w:tcPr>
+            <w:tcW w:type="dxa" w:w="3260"/>
+            <w:tcMar>
+              <w:top w:type="dxa" w:w="60"/>
+              <w:left w:type="dxa" w:w="110"/>
+              <w:bottom w:type="dxa" w:w="60"/>
+              <w:right w:type="dxa" w:w="110"/>
+            </w:tcMar>
+            <w:vAlign w:val="center"/>
+          </w:tcPr>
+          <w:p>
+            <w:pPr>
+              <w:spacing w:after="0" w:line="270" w:lineRule="auto"/>
+              <w:jc w:val="left"/>
+            </w:pPr>
+            <w:r>
+              <w:rPr>
+                <w:rFonts w:ascii="Arial" w:eastAsia="微软雅黑" w:hAnsi="Arial"/>
+                <w:b w:val="false"/>
+                <w:bCs w:val="false"/>
+                <w:i w:val="false"/>
+                <w:iCs w:val="false"/>
+                <w:color w:val="000000"/>
+                <w:sz w:val="18"/>
+                <w:szCs w:val="18"/>
+              </w:rPr>
+              <w:t xml:space="preserve">http://115.191.76.40/</w:t>
+            </w:r>
+          </w:p>
+        </w:tc>
+        <w:tc>
+          <w:tcPr>
+            <w:tcW w:type="dxa" w:w="4000"/>
+            <w:tcMar>
+              <w:top w:type="dxa" w:w="60"/>
+              <w:left w:type="dxa" w:w="110"/>
+              <w:bottom w:type="dxa" w:w="60"/>
+              <w:right w:type="dxa" w:w="110"/>
+            </w:tcMar>
+            <w:vAlign w:val="center"/>
+          </w:tcPr>
+          <w:p>
+            <w:pPr>
+              <w:spacing w:after="0" w:line="270" w:lineRule="auto"/>
+              <w:jc w:val="left"/>
+            </w:pPr>
+            <w:r>
+              <w:rPr>
+                <w:rFonts w:ascii="Arial" w:eastAsia="微软雅黑" w:hAnsi="Arial"/>
+                <w:b w:val="false"/>
+                <w:bCs w:val="false"/>
+                <w:i w:val="false"/>
+                <w:iCs w:val="false"/>
+                <w:color w:val="000000"/>
+                <w:sz w:val="18"/>
+                <w:szCs w:val="18"/>
+              </w:rPr>
+              <w:t xml:space="preserve">两端同框展示——手机框与浏览器框并列、均复用生产组件，便于评委一屏看完商家端与移动端的完整闭环</w:t>
             </w:r>
           </w:p>
         </w:tc>
@@ -3887,16 +3887,16 @@
                 <w:i w:val="false"/>
                 <w:iCs w:val="false"/>
                 <w:color w:val="000000"/>
-                <w:sz w:val="19"/>
-                <w:szCs w:val="19"/>
-              </w:rPr>
-              <w:t xml:space="preserve">健康检查</w:t>
-            </w:r>
-          </w:p>
-        </w:tc>
-        <w:tc>
-          <w:tcPr>
-            <w:tcW w:type="dxa" w:w="3500"/>
+                <w:sz w:val="18"/>
+                <w:szCs w:val="18"/>
+              </w:rPr>
+              <w:t xml:space="preserve">PC 管理后台</w:t>
+            </w:r>
+          </w:p>
+        </w:tc>
+        <w:tc>
+          <w:tcPr>
+            <w:tcW w:type="dxa" w:w="3260"/>
             <w:shd w:fill="EAF0FA" w:color="auto" w:val="clear"/>
             <w:tcMar>
               <w:top w:type="dxa" w:w="60"/>
@@ -3919,16 +3919,16 @@
                 <w:i w:val="false"/>
                 <w:iCs w:val="false"/>
                 <w:color w:val="000000"/>
-                <w:sz w:val="19"/>
-                <w:szCs w:val="19"/>
-              </w:rPr>
-              <w:t xml:space="preserve">http://115.191.76.40/healthz</w:t>
-            </w:r>
-          </w:p>
-        </w:tc>
-        <w:tc>
-          <w:tcPr>
-            <w:tcW w:type="dxa" w:w="3760"/>
+                <w:sz w:val="18"/>
+                <w:szCs w:val="18"/>
+              </w:rPr>
+              <w:t xml:space="preserve">http://115.191.76.40/#/admin</w:t>
+            </w:r>
+          </w:p>
+        </w:tc>
+        <w:tc>
+          <w:tcPr>
+            <w:tcW w:type="dxa" w:w="4000"/>
             <w:shd w:fill="EAF0FA" w:color="auto" w:val="clear"/>
             <w:tcMar>
               <w:top w:type="dxa" w:w="60"/>
@@ -3951,10 +3951,10 @@
                 <w:i w:val="false"/>
                 <w:iCs w:val="false"/>
                 <w:color w:val="000000"/>
-                <w:sz w:val="19"/>
-                <w:szCs w:val="19"/>
-              </w:rPr>
-              <w:t xml:space="preserve">任意时刻可探活</w:t>
+                <w:sz w:val="18"/>
+                <w:szCs w:val="18"/>
+              </w:rPr>
+              <w:t xml:space="preserve">Ant Design 完整后台（含 /#/admin/publish、/#/admin/auctions 子页），用于商家上架、规则配置与订单管理</w:t>
             </w:r>
           </w:p>
         </w:tc>
@@ -3987,271 +3987,72 @@
                 <w:i w:val="false"/>
                 <w:iCs w:val="false"/>
                 <w:color w:val="000000"/>
-                <w:sz w:val="19"/>
-                <w:szCs w:val="19"/>
-              </w:rPr>
-              <w:t xml:space="preserve">部署身份</w:t>
-            </w:r>
-          </w:p>
-        </w:tc>
-        <w:tc>
-          <w:tcPr>
-            <w:tcW w:type="dxa" w:w="3500"/>
-            <w:tcMar>
-              <w:top w:type="dxa" w:w="60"/>
-              <w:left w:type="dxa" w:w="110"/>
-              <w:bottom w:type="dxa" w:w="60"/>
-              <w:right w:type="dxa" w:w="110"/>
-            </w:tcMar>
-            <w:vAlign w:val="center"/>
-          </w:tcPr>
-          <w:p>
-            <w:pPr>
-              <w:spacing w:after="0" w:line="270" w:lineRule="auto"/>
-              <w:jc w:val="left"/>
-            </w:pPr>
-            <w:r>
-              <w:rPr>
-                <w:rFonts w:ascii="Arial" w:eastAsia="微软雅黑" w:hAnsi="Arial"/>
-                <w:b w:val="false"/>
-                <w:bCs w:val="false"/>
-                <w:i w:val="false"/>
-                <w:iCs w:val="false"/>
-                <w:color w:val="000000"/>
-                <w:sz w:val="19"/>
-                <w:szCs w:val="19"/>
-              </w:rPr>
-              <w:t xml:space="preserve">http://115.191.76.40/version</w:t>
-            </w:r>
-          </w:p>
-        </w:tc>
-        <w:tc>
-          <w:tcPr>
-            <w:tcW w:type="dxa" w:w="3760"/>
-            <w:tcMar>
-              <w:top w:type="dxa" w:w="60"/>
-              <w:left w:type="dxa" w:w="110"/>
-              <w:bottom w:type="dxa" w:w="60"/>
-              <w:right w:type="dxa" w:w="110"/>
-            </w:tcMar>
-            <w:vAlign w:val="center"/>
-          </w:tcPr>
-          <w:p>
-            <w:pPr>
-              <w:spacing w:after="0" w:line="270" w:lineRule="auto"/>
-              <w:jc w:val="left"/>
-            </w:pPr>
-            <w:r>
-              <w:rPr>
-                <w:rFonts w:ascii="Arial" w:eastAsia="微软雅黑" w:hAnsi="Arial"/>
-                <w:b w:val="false"/>
-                <w:bCs w:val="false"/>
-                <w:i w:val="false"/>
-                <w:iCs w:val="false"/>
-                <w:color w:val="000000"/>
-                <w:sz w:val="19"/>
-                <w:szCs w:val="19"/>
-              </w:rPr>
-              <w:t xml:space="preserve">确认线上即为持续集成验证过的二进制</w:t>
-            </w:r>
-          </w:p>
-        </w:tc>
-      </w:tr>
-      <w:tr>
-        <w:trPr>
-          <w:tblHeader w:val="false"/>
-        </w:trPr>
-        <w:tc>
-          <w:tcPr>
-            <w:tcW w:type="dxa" w:w="2100"/>
-            <w:shd w:fill="EAF0FA" w:color="auto" w:val="clear"/>
-            <w:tcMar>
-              <w:top w:type="dxa" w:w="60"/>
-              <w:left w:type="dxa" w:w="110"/>
-              <w:bottom w:type="dxa" w:w="60"/>
-              <w:right w:type="dxa" w:w="110"/>
-            </w:tcMar>
-            <w:vAlign w:val="center"/>
-          </w:tcPr>
-          <w:p>
-            <w:pPr>
-              <w:spacing w:after="0" w:line="270" w:lineRule="auto"/>
-              <w:jc w:val="left"/>
-            </w:pPr>
-            <w:r>
-              <w:rPr>
-                <w:rFonts w:ascii="Arial" w:eastAsia="微软雅黑" w:hAnsi="Arial"/>
-                <w:b/>
-                <w:bCs/>
-                <w:i w:val="false"/>
-                <w:iCs w:val="false"/>
-                <w:color w:val="000000"/>
-                <w:sz w:val="19"/>
-                <w:szCs w:val="19"/>
-              </w:rPr>
-              <w:t xml:space="preserve">商家后台</w:t>
-            </w:r>
-          </w:p>
-        </w:tc>
-        <w:tc>
-          <w:tcPr>
-            <w:tcW w:type="dxa" w:w="3500"/>
-            <w:shd w:fill="EAF0FA" w:color="auto" w:val="clear"/>
-            <w:tcMar>
-              <w:top w:type="dxa" w:w="60"/>
-              <w:left w:type="dxa" w:w="110"/>
-              <w:bottom w:type="dxa" w:w="60"/>
-              <w:right w:type="dxa" w:w="110"/>
-            </w:tcMar>
-            <w:vAlign w:val="center"/>
-          </w:tcPr>
-          <w:p>
-            <w:pPr>
-              <w:spacing w:after="0" w:line="270" w:lineRule="auto"/>
-              <w:jc w:val="left"/>
-            </w:pPr>
-            <w:r>
-              <w:rPr>
-                <w:rFonts w:ascii="Arial" w:eastAsia="微软雅黑" w:hAnsi="Arial"/>
-                <w:b w:val="false"/>
-                <w:bCs w:val="false"/>
-                <w:i w:val="false"/>
-                <w:iCs w:val="false"/>
-                <w:color w:val="000000"/>
-                <w:sz w:val="19"/>
-                <w:szCs w:val="19"/>
-              </w:rPr>
-              <w:t xml:space="preserve">http://115.191.76.40/admin</w:t>
-            </w:r>
-          </w:p>
-        </w:tc>
-        <w:tc>
-          <w:tcPr>
-            <w:tcW w:type="dxa" w:w="3760"/>
-            <w:shd w:fill="EAF0FA" w:color="auto" w:val="clear"/>
-            <w:tcMar>
-              <w:top w:type="dxa" w:w="60"/>
-              <w:left w:type="dxa" w:w="110"/>
-              <w:bottom w:type="dxa" w:w="60"/>
-              <w:right w:type="dxa" w:w="110"/>
-            </w:tcMar>
-            <w:vAlign w:val="center"/>
-          </w:tcPr>
-          <w:p>
-            <w:pPr>
-              <w:spacing w:after="0" w:line="270" w:lineRule="auto"/>
-              <w:jc w:val="left"/>
-            </w:pPr>
-            <w:r>
-              <w:rPr>
-                <w:rFonts w:ascii="Arial" w:eastAsia="微软雅黑" w:hAnsi="Arial"/>
-                <w:b w:val="false"/>
-                <w:bCs w:val="false"/>
-                <w:i w:val="false"/>
-                <w:iCs w:val="false"/>
-                <w:color w:val="000000"/>
-                <w:sz w:val="19"/>
-                <w:szCs w:val="19"/>
-              </w:rPr>
-              <w:t xml:space="preserve">需卖家登录</w:t>
-            </w:r>
-          </w:p>
-        </w:tc>
-      </w:tr>
-      <w:tr>
-        <w:trPr>
-          <w:tblHeader w:val="false"/>
-        </w:trPr>
-        <w:tc>
-          <w:tcPr>
-            <w:tcW w:type="dxa" w:w="2100"/>
-            <w:tcMar>
-              <w:top w:type="dxa" w:w="60"/>
-              <w:left w:type="dxa" w:w="110"/>
-              <w:bottom w:type="dxa" w:w="60"/>
-              <w:right w:type="dxa" w:w="110"/>
-            </w:tcMar>
-            <w:vAlign w:val="center"/>
-          </w:tcPr>
-          <w:p>
-            <w:pPr>
-              <w:spacing w:after="0" w:line="270" w:lineRule="auto"/>
-              <w:jc w:val="left"/>
-            </w:pPr>
-            <w:r>
-              <w:rPr>
-                <w:rFonts w:ascii="Arial" w:eastAsia="微软雅黑" w:hAnsi="Arial"/>
-                <w:b/>
-                <w:bCs/>
-                <w:i w:val="false"/>
-                <w:iCs w:val="false"/>
-                <w:color w:val="000000"/>
-                <w:sz w:val="19"/>
-                <w:szCs w:val="19"/>
-              </w:rPr>
-              <w:t xml:space="preserve">评委导演模式</w:t>
-            </w:r>
-          </w:p>
-        </w:tc>
-        <w:tc>
-          <w:tcPr>
-            <w:tcW w:type="dxa" w:w="3500"/>
-            <w:tcMar>
-              <w:top w:type="dxa" w:w="60"/>
-              <w:left w:type="dxa" w:w="110"/>
-              <w:bottom w:type="dxa" w:w="60"/>
-              <w:right w:type="dxa" w:w="110"/>
-            </w:tcMar>
-            <w:vAlign w:val="center"/>
-          </w:tcPr>
-          <w:p>
-            <w:pPr>
-              <w:spacing w:after="0" w:line="270" w:lineRule="auto"/>
-              <w:jc w:val="left"/>
-            </w:pPr>
-            <w:r>
-              <w:rPr>
-                <w:rFonts w:ascii="Arial" w:eastAsia="微软雅黑" w:hAnsi="Arial"/>
-                <w:b w:val="false"/>
-                <w:bCs w:val="false"/>
-                <w:i w:val="false"/>
-                <w:iCs w:val="false"/>
-                <w:color w:val="000000"/>
-                <w:sz w:val="19"/>
-                <w:szCs w:val="19"/>
-              </w:rPr>
-              <w:t xml:space="preserve">http://115.191.76.40/showcase</w:t>
-            </w:r>
-          </w:p>
-        </w:tc>
-        <w:tc>
-          <w:tcPr>
-            <w:tcW w:type="dxa" w:w="3760"/>
-            <w:tcMar>
-              <w:top w:type="dxa" w:w="60"/>
-              <w:left w:type="dxa" w:w="110"/>
-              <w:bottom w:type="dxa" w:w="60"/>
-              <w:right w:type="dxa" w:w="110"/>
-            </w:tcMar>
-            <w:vAlign w:val="center"/>
-          </w:tcPr>
-          <w:p>
-            <w:pPr>
-              <w:spacing w:after="0" w:line="270" w:lineRule="auto"/>
-              <w:jc w:val="left"/>
-            </w:pPr>
-            <w:r>
-              <w:rPr>
-                <w:rFonts w:ascii="Arial" w:eastAsia="微软雅黑" w:hAnsi="Arial"/>
-                <w:b w:val="false"/>
-                <w:bCs w:val="false"/>
-                <w:i w:val="false"/>
-                <w:iCs w:val="false"/>
-                <w:color w:val="000000"/>
-                <w:sz w:val="19"/>
-                <w:szCs w:val="19"/>
-              </w:rPr>
-              <w:t xml:space="preserve">六步按钮走完拍卖闭环；演示当天若已部署则推荐为首选入口，否则改用首页加直播间组合（本地始终可用）</w:t>
+                <w:sz w:val="18"/>
+                <w:szCs w:val="18"/>
+              </w:rPr>
+              <w:t xml:space="preserve">移动端用户端</w:t>
+            </w:r>
+          </w:p>
+        </w:tc>
+        <w:tc>
+          <w:tcPr>
+            <w:tcW w:type="dxa" w:w="3260"/>
+            <w:tcMar>
+              <w:top w:type="dxa" w:w="60"/>
+              <w:left w:type="dxa" w:w="110"/>
+              <w:bottom w:type="dxa" w:w="60"/>
+              <w:right w:type="dxa" w:w="110"/>
+            </w:tcMar>
+            <w:vAlign w:val="center"/>
+          </w:tcPr>
+          <w:p>
+            <w:pPr>
+              <w:spacing w:after="0" w:line="270" w:lineRule="auto"/>
+              <w:jc w:val="left"/>
+            </w:pPr>
+            <w:r>
+              <w:rPr>
+                <w:rFonts w:ascii="Arial" w:eastAsia="微软雅黑" w:hAnsi="Arial"/>
+                <w:b w:val="false"/>
+                <w:bCs w:val="false"/>
+                <w:i w:val="false"/>
+                <w:iCs w:val="false"/>
+                <w:color w:val="000000"/>
+                <w:sz w:val="18"/>
+                <w:szCs w:val="18"/>
+              </w:rPr>
+              <w:t xml:space="preserve">http://115.191.76.40/#/m</w:t>
+            </w:r>
+          </w:p>
+        </w:tc>
+        <w:tc>
+          <w:tcPr>
+            <w:tcW w:type="dxa" w:w="4000"/>
+            <w:tcMar>
+              <w:top w:type="dxa" w:w="60"/>
+              <w:left w:type="dxa" w:w="110"/>
+              <w:bottom w:type="dxa" w:w="60"/>
+              <w:right w:type="dxa" w:w="110"/>
+            </w:tcMar>
+            <w:vAlign w:val="center"/>
+          </w:tcPr>
+          <w:p>
+            <w:pPr>
+              <w:spacing w:after="0" w:line="270" w:lineRule="auto"/>
+              <w:jc w:val="left"/>
+            </w:pPr>
+            <w:r>
+              <w:rPr>
+                <w:rFonts w:ascii="Arial" w:eastAsia="微软雅黑" w:hAnsi="Arial"/>
+                <w:b w:val="false"/>
+                <w:bCs w:val="false"/>
+                <w:i w:val="false"/>
+                <w:iCs w:val="false"/>
+                <w:color w:val="000000"/>
+                <w:sz w:val="18"/>
+                <w:szCs w:val="18"/>
+              </w:rPr>
+              <w:t xml:space="preserve">全屏可交互移动端，手机直接访问即为原生体验，用于买家进直播间、出价与查看证据</w:t>
             </w:r>
           </w:p>
         </w:tc>
@@ -4292,7 +4093,7 @@
           <w:sz w:val="21"/>
           <w:szCs w:val="21"/>
         </w:rPr>
-        <w:t xml:space="preserve">入口可用性说明</w:t>
+        <w:t xml:space="preserve">体验账号说明</w:t>
       </w:r>
       <w:r>
         <w:rPr>
@@ -4305,38 +4106,6 @@
           <w:sz w:val="21"/>
           <w:szCs w:val="21"/>
         </w:rPr>
-        <w:t xml:space="preserve">：评委导演模式 `/showcase` 为本团队为评审准备的一键演示入口，其公网部署以演示当天主分支冻结并完成持续交付为准；若当天尚未部署完成，请改用「生产公网入口首页 + 直播间」组合，或在本地通过容器编排一键启动后访问 `http://localhost:8080/showcase`，效果一致。</w:t>
-      </w:r>
-    </w:p>
-    <w:p>
-      <w:pPr>
-        <w:spacing w:after="130" w:before="0" w:line="300" w:lineRule="auto"/>
-        <w:jc w:val="both"/>
-      </w:pPr>
-      <w:r>
-        <w:rPr>
-          <w:rFonts w:ascii="Arial" w:eastAsia="微软雅黑" w:hAnsi="Arial"/>
-          <w:b/>
-          <w:bCs/>
-          <w:i w:val="false"/>
-          <w:iCs w:val="false"/>
-          <w:color w:val="000000"/>
-          <w:sz w:val="21"/>
-          <w:szCs w:val="21"/>
-        </w:rPr>
-        <w:t xml:space="preserve">体验账号说明</w:t>
-      </w:r>
-      <w:r>
-        <w:rPr>
-          <w:rFonts w:ascii="Arial" w:eastAsia="微软雅黑" w:hAnsi="Arial"/>
-          <w:b w:val="false"/>
-          <w:bCs w:val="false"/>
-          <w:i w:val="false"/>
-          <w:iCs w:val="false"/>
-          <w:color w:val="000000"/>
-          <w:sz w:val="21"/>
-          <w:szCs w:val="21"/>
-        </w:rPr>
         <w:t xml:space="preserve">：生产环境关闭开发态免登录，买家可在登录接口提交昵称即时获得买家令牌；卖家账号在演示当天由团队口头提供，评委亦可在本地通过容器编排一键启动后使用开发态免登录直接获得卖家身份。本地最小复现命令见第九章。</w:t>
       </w:r>
     </w:p>
@@ -4458,7 +4227,7 @@
           <w:sz w:val="22"/>
           <w:szCs w:val="22"/>
         </w:rPr>
-        <w:t xml:space="preserve">持续集成由四道门禁组成（后端、前端、端到端、规范守卫），通过后由持续交付流水线自动部署至 ECS；部署完成后再以版本接口的构建标识与期望值强校验，校验失败则视为部署未生效。这一机制确保了「评委看到的线上系统，正是持续集成验证通过的那个二进制」。提交时刻主分支 HEAD（演示前替换为冻结提交号）：</w:t>
+        <w:t xml:space="preserve">持续集成由四道门禁组成（后端、前端、端到端、规范守卫），通过后由持续交付流水线自动部署至 ECS；部署完成后再以版本接口的构建标识与期望值强校验，校验失败则视为部署未生效。这一机制确保了「评委看到的线上系统，正是持续集成验证通过的那个二进制」。主干冻结提交号（2026 年 6 月 8 日冻结）：</w:t>
       </w:r>
       <w:r>
         <w:rPr>
@@ -4471,7 +4240,7 @@
           <w:sz w:val="22"/>
           <w:szCs w:val="22"/>
         </w:rPr>
-        <w:t xml:space="preserve">［freeze SHA］</w:t>
+        <w:t xml:space="preserve">4a4f42f</w:t>
       </w:r>
       <w:r>
         <w:rPr>
@@ -4484,33 +4253,7 @@
           <w:sz w:val="22"/>
           <w:szCs w:val="22"/>
         </w:rPr>
-        <w:t xml:space="preserve">；对应持续集成运行记录：</w:t>
-      </w:r>
-      <w:r>
-        <w:rPr>
-          <w:rFonts w:ascii="Arial" w:eastAsia="微软雅黑" w:hAnsi="Arial"/>
-          <w:b/>
-          <w:bCs/>
-          <w:i w:val="false"/>
-          <w:iCs w:val="false"/>
-          <w:color w:val="000000"/>
-          <w:sz w:val="22"/>
-          <w:szCs w:val="22"/>
-        </w:rPr>
-        <w:t xml:space="preserve">［https://github.com/Eliaaazzz/live-auction-system/actions/runs/＜id＞］</w:t>
-      </w:r>
-      <w:r>
-        <w:rPr>
-          <w:rFonts w:ascii="Arial" w:eastAsia="微软雅黑" w:hAnsi="Arial"/>
-          <w:b w:val="false"/>
-          <w:bCs w:val="false"/>
-          <w:i w:val="false"/>
-          <w:iCs w:val="false"/>
-          <w:color w:val="000000"/>
-          <w:sz w:val="22"/>
-          <w:szCs w:val="22"/>
-        </w:rPr>
-        <w:t xml:space="preserve">。</w:t>
+        <w:t xml:space="preserve">；其持续集成运行记录为 https://github.com/Eliaaazzz/live-auction-system/actions/runs/27138537500（成功，并级联触发生产部署）。</w:t>
       </w:r>
     </w:p>
     <w:p>
@@ -4755,7 +4498,7 @@
                 <w:sz w:val="17"/>
                 <w:szCs w:val="17"/>
               </w:rPr>
-              <w:t xml:space="preserve">open http://localhost:8080/             # 首页</w:t>
+              <w:t xml:space="preserve">open http://localhost:8080/         # 首页（Showcase 演示入口）</w:t>
             </w:r>
           </w:p>
           <w:p>
@@ -4773,7 +4516,7 @@
                 <w:sz w:val="17"/>
                 <w:szCs w:val="17"/>
               </w:rPr>
-              <w:t xml:space="preserve">open http://localhost:8080/admin        # 商家后台（开发态免登录已启用）</w:t>
+              <w:t xml:space="preserve">open http://localhost:8080/#/admin  # 商家后台（开发态免登录已启用）</w:t>
             </w:r>
           </w:p>
           <w:p>
@@ -4791,7 +4534,7 @@
                 <w:sz w:val="17"/>
                 <w:szCs w:val="17"/>
               </w:rPr>
-              <w:t xml:space="preserve">open http://localhost:8080/room/auc_demo  # 直播间</w:t>
+              <w:t xml:space="preserve">open http://localhost:8080/#/m      # 移动端用户端（买家进直播间）</w:t>
             </w:r>
           </w:p>
           <w:p>
@@ -7849,7 +7592,7 @@
           <w:sz w:val="22"/>
           <w:szCs w:val="22"/>
         </w:rPr>
-        <w:t xml:space="preserve">演示当天最怕的情形是「部署的是过期分支」——持续集成全绿，但 ECS 上跑的却是上周的二进制。我们曾在一次北京万级测试中被新旧协议版本不匹配打断，因而把「部署身份」上升为一等工程问题。解决方案由四部分组成：版本接口返回协议版本、构建标识、构建时间与运行环境；持续交付流水线在部署后以版本接口的构建标识与期望值强校验，校验失败即视为部署未生效；另有部署前的预检脚本执行同样的校验逻辑作为干跑门禁；上传采用分块加哈希校验，避免网络抖动下「半上传半失败」的尴尬状态。这套机制让评委可以通过访问版本接口，一眼确认线上系统的新鲜度与真实性。</w:t>
+        <w:t xml:space="preserve">演示当天最怕的情形是「部署的是过期分支」——持续集成全绿，但 ECS 上跑的却是上周的二进制。我们曾在一次北京万级测试中被新旧协议版本不匹配打断，因而把「部署身份」上升为一等工程问题。解决方案由四部分组成：版本接口返回协议版本、构建标识、构建时间与运行环境；持续交付流水线在部署后以版本接口的构建标识与期望值强校验，校验失败即视为部署未生效；另有部署前的预检脚本执行同样的校验逻辑作为干跑门禁；上传采用分块加哈希校验，避免网络抖动下「半上传半失败」的尴尬状态。这套机制让线上系统的新鲜度与真实性在部署环节即被强校验锁定；版本接口同时对外可达，评委可直接访问以一眼确认线上系统的新鲜度与真实性，从机制上保证「线上运行的，正是持续集成验证通过的那个二进制」。</w:t>
       </w:r>
     </w:p>
     <w:p>
@@ -8872,7 +8615,7 @@
           <w:sz w:val="22"/>
           <w:szCs w:val="22"/>
         </w:rPr>
-        <w:t xml:space="preserve">最后，我们把工程可信度做成了评委可见的界面元素。评委导演模式以六步按钮（末十秒、甲方出价、乙方反超、反狙延时、落锤、证据卡）一键走完拍卖闭环，复用生产组件注入确定性参数，演示当天无需依赖任何网络或种子数据；首页将最热直播场次剧场化为第一屏舞台；每个房间顶部的工程信息条可展开为「连接正常 · 序号 · 漂移 · 出价速率 · 延时次数」，让一致性与实时性这些通常看不见的工程属性，直接呈现在评委眼前。</w:t>
+        <w:t xml:space="preserve">最后，我们把工程可信度做成了评委可见的界面元素。演示入口将手机框与浏览器框两端同框并列，且两侧均复用生产组件而非另搭一套演示页，评委可在一屏之内看完从「商家上架、规则配置」到「买家进场、出价、反超、反狙延时、落锤、证据卡」的完整闭环；每个房间顶部的工程信息条可展开为「连接正常 · 序号 · 漂移 · 出价速率 · 延时次数」，让一致性与实时性这些通常看不见的工程属性，直接呈现在评委眼前。</w:t>
       </w:r>
     </w:p>
     <w:p>
@@ -10018,7 +9761,7 @@
           <w:sz w:val="22"/>
           <w:szCs w:val="22"/>
         </w:rPr>
-        <w:t xml:space="preserve">为验证应用层结论在真实公网下依然成立，我们以异地按量计费的压测机（上海）经公网弹性 IP 打向北京网关的裸二进制，规避了单主机自拨的回环拓扑问题。在「九千九百名观众 + 一百名出价者、约每秒五百笔出价」的拓扑下，全程维持一万并发连接，拍卖干净成交，出价确认时延 95 分位为 0.46 毫秒、补丁时延 95 分位 73 毫秒、序号空洞与背压强制关闭均为零。这是本系统「真公网万人」的首个硬实证，与环回、私网两组证据共同三方支撑了应用层单房间万级能力的结论。完整数据见 issue #233 的摘要表（含十千基线、十千四比六与两万风暴三场景实测）与 #231（公网万人达标定性，已关闭）。</w:t>
+        <w:t xml:space="preserve">为验证应用层结论在真实公网下依然成立，我们以异地按量计费的压测机（上海）经公网弹性 IP 打向北京网关的裸二进制，规避了单主机自拨的回环拓扑问题。在「九千九百名观众 + 一百名出价者、约每秒五百笔出价」的拓扑下，全程维持一万并发连接，拍卖干净成交，出价确认时延 95 分位为 0.46 毫秒、补丁时延 95 分位 73 毫秒、序号空洞与背压强制关闭均为零。这是本系统「真公网万人」的首个硬实证，与环回、私网两组证据共同三方支撑了应用层单房间万级能力的结论。三个真公网场景（万人基线、万人高活跃、两万风暴）的完整数据见仓库性能报告 `docs/reports/2026-06-07-tier2-public-loadtest-10k-20k.md`，issue 跟踪为 #233 与 #231（公网万人达标定性，已关闭）。</w:t>
       </w:r>
     </w:p>
     <w:p>
@@ -10037,7 +9780,7 @@
           <w:sz w:val="22"/>
           <w:szCs w:val="22"/>
         </w:rPr>
-        <w:t xml:space="preserve">C. 容量边界探测——诚实边界</w:t>
+        <w:t xml:space="preserve">C. 真公网万人高活跃——SLO 与正确性达标，诚实声明早退（2026 年 6 月 7 日）</w:t>
       </w:r>
     </w:p>
     <w:p>
@@ -10056,7 +9799,26 @@
           <w:sz w:val="22"/>
           <w:szCs w:val="22"/>
         </w:rPr>
-        <w:t xml:space="preserve">我们进一步把活跃出价者从一百名拉高到一万名（目标约每秒五万笔出价、总连接约两万），观察系统的崩溃姿态。结果是单网关进程在峰值约一万五千七百七十七（15,777）连接时崩溃并自动重启，但崩溃前后序号空洞始终为零、无客户端被强制关闭，Redis 中的拍卖状态扛过了重启。换言之，进程虽死，正确性始终不破。</w:t>
+        <w:t xml:space="preserve">为在轻量基线之外贴近真实直播的负载，我们在同一公网拓扑下把出价比例拉高到四比六——六千名观众加四千名活跃出价者，端到端约每秒两万笔出价的压力。结果是连接侧成功一万、失败为零、峰值并发一万（稳态约九千八百七十四）；服务端在这一约四十倍于基线的出价压力下，出价确认时延 95 分位仍稳定在 3.5 毫秒、状态补丁 95 分位 58 毫秒，序号空洞与背压强制关闭仍均为零。约百分之九十九点九七注定失败的低价出价被网关在 Lua 裁决之前以 fast-reject 提前拦截，真正进入原子裁决的仅约两千零九十六笔——这是网关设计的预期效果，而非侥幸。需要诚实交代的是，本场景有约百分之一点三（126 条）连接在拍卖结束前主动关闭退出；我们因此把判定写为「高活跃万人 SLO 与正确性达标，早退作为诚实边界单独记录」，而不宣称「全程零早退」。把这条小尾巴讲清楚，正是诚实边界原则的当场兑现。以挑战二「百人以上同时狂点出价按钮」的基础要求衡量，四千名活跃出价者构成约四十倍压力，而 80 毫秒的服务端确认时延预算仍有约二十三倍富余。</w:t>
+      </w:r>
+    </w:p>
+    <w:p>
+      <w:pPr>
+        <w:pStyle w:val="Heading3"/>
+        <w:spacing w:after="90" w:before="160"/>
+      </w:pPr>
+      <w:r>
+        <w:rPr>
+          <w:rFonts w:ascii="Arial" w:eastAsia="微软雅黑" w:hAnsi="Arial"/>
+          <w:b/>
+          <w:bCs/>
+          <w:i w:val="false"/>
+          <w:iCs w:val="false"/>
+          <w:color w:val="44546A"/>
+          <w:sz w:val="22"/>
+          <w:szCs w:val="22"/>
+        </w:rPr>
+        <w:t xml:space="preserve">D. 容量边界探测——诚实边界（已转化为工程任务）</w:t>
       </w:r>
     </w:p>
     <w:p>
@@ -10075,7 +9837,969 @@
           <w:sz w:val="22"/>
           <w:szCs w:val="22"/>
         </w:rPr>
-        <w:t xml:space="preserve">我们把这条数据视作亮点而非污点：它证明系统知道自己的容量边界在哪里，且压垮时的姿态是受保护的优雅崩溃与恢复。因此，我们的演示口径不会宣称「单网关稳定支持两万连接、每秒五万笔出价」，这是一处边界发现，而非达标项。后续工作将沿准入控制、多网关扇出与内存上限调优的路线推进。</w:t>
+        <w:t xml:space="preserve">我们进一步把活跃出价者从一百名拉高到一万名（目标约每秒五万笔出价、总连接约两万），观察系统的崩溃姿态。结果是单网关进程在峰值约一万五千七百七十七（15,777）连接时崩溃并自动重启，但崩溃前后序号空洞始终为零、无客户端被强制关闭，Redis 中的拍卖状态扛过了重启、序号连续。换言之，进程虽死，正确性始终不破。结合背压强制关闭为零、补丁时延仍约 73 毫秒、压测机负载与带宽均未打满等证据，我们把根因定位为网关进程的 CPU、内存与垃圾回收压力，而非压测机或网络带宽瓶颈。</w:t>
+      </w:r>
+    </w:p>
+    <w:p>
+      <w:pPr>
+        <w:spacing w:after="130" w:before="0" w:line="300" w:lineRule="auto"/>
+        <w:jc w:val="both"/>
+      </w:pPr>
+      <w:r>
+        <w:rPr>
+          <w:rFonts w:ascii="Arial" w:eastAsia="微软雅黑" w:hAnsi="Arial"/>
+          <w:b w:val="false"/>
+          <w:bCs w:val="false"/>
+          <w:i w:val="false"/>
+          <w:iCs w:val="false"/>
+          <w:color w:val="000000"/>
+          <w:sz w:val="22"/>
+          <w:szCs w:val="22"/>
+        </w:rPr>
+        <w:t xml:space="preserve">我们把这条数据视作亮点而非污点：它证明系统知道自己的容量边界在哪里，且压垮时的姿态是受保护的优雅崩溃与恢复。因此，我们的演示口径不会宣称「单网关稳定支持两万连接、每秒五万笔出价」，这是一处边界发现，而非达标项。更重要的是，这条边界已被转化为具体的工程任务：准入控制与单连接内存削减已在 PR #235 合入主分支——连接数达上限时网关返回 503 与 Retry-After、单连接发送缓冲减半、并新增堆内存与 goroutine 数等实时指标与 `admissionRejected` 计数，把单网关的崩溃悬崖转化为可观测的优雅降载；针对请求生命周期之外的后台 goroutine（订阅、持久化、定时与 AI 派发）的 panic 根因兜底（PR #242，持续集成全绿待合）进一步收口，新增 `goroutinePanics` 指标。多网关扇出与内存上限调优仍在后续路线上。</w:t>
+      </w:r>
+    </w:p>
+    <w:tbl>
+      <w:tblPr>
+        <w:tblW w:type="dxa" w:w="9360"/>
+        <w:tblBorders>
+          <w:top w:val="single" w:color="BFBFBF" w:sz="4"/>
+          <w:left w:val="single" w:color="BFBFBF" w:sz="4"/>
+          <w:bottom w:val="single" w:color="BFBFBF" w:sz="4"/>
+          <w:right w:val="single" w:color="BFBFBF" w:sz="4"/>
+          <w:insideH w:val="single" w:color="BFBFBF" w:sz="4"/>
+          <w:insideV w:val="single" w:color="BFBFBF" w:sz="4"/>
+        </w:tblBorders>
+      </w:tblPr>
+      <w:tblGrid>
+        <w:gridCol w:w="1500"/>
+        <w:gridCol w:w="2160"/>
+        <w:gridCol w:w="1400"/>
+        <w:gridCol w:w="1100"/>
+        <w:gridCol w:w="1000"/>
+        <w:gridCol w:w="1100"/>
+        <w:gridCol w:w="1100"/>
+      </w:tblGrid>
+      <w:tr>
+        <w:trPr>
+          <w:tblHeader/>
+        </w:trPr>
+        <w:tc>
+          <w:tcPr>
+            <w:tcW w:type="dxa" w:w="1500"/>
+            <w:shd w:fill="D9E2F3" w:color="auto" w:val="clear"/>
+            <w:tcMar>
+              <w:top w:type="dxa" w:w="60"/>
+              <w:left w:type="dxa" w:w="110"/>
+              <w:bottom w:type="dxa" w:w="60"/>
+              <w:right w:type="dxa" w:w="110"/>
+            </w:tcMar>
+            <w:vAlign w:val="center"/>
+          </w:tcPr>
+          <w:p>
+            <w:pPr>
+              <w:spacing w:after="0" w:line="270" w:lineRule="auto"/>
+              <w:jc w:val="center"/>
+            </w:pPr>
+            <w:r>
+              <w:rPr>
+                <w:rFonts w:ascii="Arial" w:eastAsia="微软雅黑" w:hAnsi="Arial"/>
+                <w:b/>
+                <w:bCs/>
+                <w:i w:val="false"/>
+                <w:iCs w:val="false"/>
+                <w:color w:val="000000"/>
+                <w:sz w:val="16"/>
+                <w:szCs w:val="16"/>
+              </w:rPr>
+              <w:t xml:space="preserve">真公网场景</w:t>
+            </w:r>
+          </w:p>
+        </w:tc>
+        <w:tc>
+          <w:tcPr>
+            <w:tcW w:type="dxa" w:w="2160"/>
+            <w:shd w:fill="D9E2F3" w:color="auto" w:val="clear"/>
+            <w:tcMar>
+              <w:top w:type="dxa" w:w="60"/>
+              <w:left w:type="dxa" w:w="110"/>
+              <w:bottom w:type="dxa" w:w="60"/>
+              <w:right w:type="dxa" w:w="110"/>
+            </w:tcMar>
+            <w:vAlign w:val="center"/>
+          </w:tcPr>
+          <w:p>
+            <w:pPr>
+              <w:spacing w:after="0" w:line="270" w:lineRule="auto"/>
+              <w:jc w:val="center"/>
+            </w:pPr>
+            <w:r>
+              <w:rPr>
+                <w:rFonts w:ascii="Arial" w:eastAsia="微软雅黑" w:hAnsi="Arial"/>
+                <w:b/>
+                <w:bCs/>
+                <w:i w:val="false"/>
+                <w:iCs w:val="false"/>
+                <w:color w:val="000000"/>
+                <w:sz w:val="16"/>
+                <w:szCs w:val="16"/>
+              </w:rPr>
+              <w:t xml:space="preserve">连接构成</w:t>
+            </w:r>
+          </w:p>
+        </w:tc>
+        <w:tc>
+          <w:tcPr>
+            <w:tcW w:type="dxa" w:w="1400"/>
+            <w:shd w:fill="D9E2F3" w:color="auto" w:val="clear"/>
+            <w:tcMar>
+              <w:top w:type="dxa" w:w="60"/>
+              <w:left w:type="dxa" w:w="110"/>
+              <w:bottom w:type="dxa" w:w="60"/>
+              <w:right w:type="dxa" w:w="110"/>
+            </w:tcMar>
+            <w:vAlign w:val="center"/>
+          </w:tcPr>
+          <w:p>
+            <w:pPr>
+              <w:spacing w:after="0" w:line="270" w:lineRule="auto"/>
+              <w:jc w:val="center"/>
+            </w:pPr>
+            <w:r>
+              <w:rPr>
+                <w:rFonts w:ascii="Arial" w:eastAsia="微软雅黑" w:hAnsi="Arial"/>
+                <w:b/>
+                <w:bCs/>
+                <w:i w:val="false"/>
+                <w:iCs w:val="false"/>
+                <w:color w:val="000000"/>
+                <w:sz w:val="16"/>
+                <w:szCs w:val="16"/>
+              </w:rPr>
+              <w:t xml:space="preserve">出价压力</w:t>
+            </w:r>
+          </w:p>
+        </w:tc>
+        <w:tc>
+          <w:tcPr>
+            <w:tcW w:type="dxa" w:w="1100"/>
+            <w:shd w:fill="D9E2F3" w:color="auto" w:val="clear"/>
+            <w:tcMar>
+              <w:top w:type="dxa" w:w="60"/>
+              <w:left w:type="dxa" w:w="110"/>
+              <w:bottom w:type="dxa" w:w="60"/>
+              <w:right w:type="dxa" w:w="110"/>
+            </w:tcMar>
+            <w:vAlign w:val="center"/>
+          </w:tcPr>
+          <w:p>
+            <w:pPr>
+              <w:spacing w:after="0" w:line="270" w:lineRule="auto"/>
+              <w:jc w:val="center"/>
+            </w:pPr>
+            <w:r>
+              <w:rPr>
+                <w:rFonts w:ascii="Arial" w:eastAsia="微软雅黑" w:hAnsi="Arial"/>
+                <w:b/>
+                <w:bCs/>
+                <w:i w:val="false"/>
+                <w:iCs w:val="false"/>
+                <w:color w:val="000000"/>
+                <w:sz w:val="16"/>
+                <w:szCs w:val="16"/>
+              </w:rPr>
+              <w:t xml:space="preserve">峰值并发</w:t>
+            </w:r>
+          </w:p>
+        </w:tc>
+        <w:tc>
+          <w:tcPr>
+            <w:tcW w:type="dxa" w:w="1000"/>
+            <w:shd w:fill="D9E2F3" w:color="auto" w:val="clear"/>
+            <w:tcMar>
+              <w:top w:type="dxa" w:w="60"/>
+              <w:left w:type="dxa" w:w="110"/>
+              <w:bottom w:type="dxa" w:w="60"/>
+              <w:right w:type="dxa" w:w="110"/>
+            </w:tcMar>
+            <w:vAlign w:val="center"/>
+          </w:tcPr>
+          <w:p>
+            <w:pPr>
+              <w:spacing w:after="0" w:line="270" w:lineRule="auto"/>
+              <w:jc w:val="center"/>
+            </w:pPr>
+            <w:r>
+              <w:rPr>
+                <w:rFonts w:ascii="Arial" w:eastAsia="微软雅黑" w:hAnsi="Arial"/>
+                <w:b/>
+                <w:bCs/>
+                <w:i w:val="false"/>
+                <w:iCs w:val="false"/>
+                <w:color w:val="000000"/>
+                <w:sz w:val="16"/>
+                <w:szCs w:val="16"/>
+              </w:rPr>
+              <w:t xml:space="preserve">ack p95</w:t>
+            </w:r>
+          </w:p>
+        </w:tc>
+        <w:tc>
+          <w:tcPr>
+            <w:tcW w:type="dxa" w:w="1100"/>
+            <w:shd w:fill="D9E2F3" w:color="auto" w:val="clear"/>
+            <w:tcMar>
+              <w:top w:type="dxa" w:w="60"/>
+              <w:left w:type="dxa" w:w="110"/>
+              <w:bottom w:type="dxa" w:w="60"/>
+              <w:right w:type="dxa" w:w="110"/>
+            </w:tcMar>
+            <w:vAlign w:val="center"/>
+          </w:tcPr>
+          <w:p>
+            <w:pPr>
+              <w:spacing w:after="0" w:line="270" w:lineRule="auto"/>
+              <w:jc w:val="center"/>
+            </w:pPr>
+            <w:r>
+              <w:rPr>
+                <w:rFonts w:ascii="Arial" w:eastAsia="微软雅黑" w:hAnsi="Arial"/>
+                <w:b/>
+                <w:bCs/>
+                <w:i w:val="false"/>
+                <w:iCs w:val="false"/>
+                <w:color w:val="000000"/>
+                <w:sz w:val="16"/>
+                <w:szCs w:val="16"/>
+              </w:rPr>
+              <w:t xml:space="preserve">patch p95</w:t>
+            </w:r>
+          </w:p>
+        </w:tc>
+        <w:tc>
+          <w:tcPr>
+            <w:tcW w:type="dxa" w:w="1100"/>
+            <w:shd w:fill="D9E2F3" w:color="auto" w:val="clear"/>
+            <w:tcMar>
+              <w:top w:type="dxa" w:w="60"/>
+              <w:left w:type="dxa" w:w="110"/>
+              <w:bottom w:type="dxa" w:w="60"/>
+              <w:right w:type="dxa" w:w="110"/>
+            </w:tcMar>
+            <w:vAlign w:val="center"/>
+          </w:tcPr>
+          <w:p>
+            <w:pPr>
+              <w:spacing w:after="0" w:line="270" w:lineRule="auto"/>
+              <w:jc w:val="center"/>
+            </w:pPr>
+            <w:r>
+              <w:rPr>
+                <w:rFonts w:ascii="Arial" w:eastAsia="微软雅黑" w:hAnsi="Arial"/>
+                <w:b/>
+                <w:bCs/>
+                <w:i w:val="false"/>
+                <w:iCs w:val="false"/>
+                <w:color w:val="000000"/>
+                <w:sz w:val="16"/>
+                <w:szCs w:val="16"/>
+              </w:rPr>
+              <w:t xml:space="preserve">结果</w:t>
+            </w:r>
+          </w:p>
+        </w:tc>
+      </w:tr>
+      <w:tr>
+        <w:trPr>
+          <w:tblHeader w:val="false"/>
+        </w:trPr>
+        <w:tc>
+          <w:tcPr>
+            <w:tcW w:type="dxa" w:w="1500"/>
+            <w:tcMar>
+              <w:top w:type="dxa" w:w="60"/>
+              <w:left w:type="dxa" w:w="110"/>
+              <w:bottom w:type="dxa" w:w="60"/>
+              <w:right w:type="dxa" w:w="110"/>
+            </w:tcMar>
+            <w:vAlign w:val="center"/>
+          </w:tcPr>
+          <w:p>
+            <w:pPr>
+              <w:spacing w:after="0" w:line="270" w:lineRule="auto"/>
+              <w:jc w:val="left"/>
+            </w:pPr>
+            <w:r>
+              <w:rPr>
+                <w:rFonts w:ascii="Arial" w:eastAsia="微软雅黑" w:hAnsi="Arial"/>
+                <w:b/>
+                <w:bCs/>
+                <w:i w:val="false"/>
+                <w:iCs w:val="false"/>
+                <w:color w:val="000000"/>
+                <w:sz w:val="16"/>
+                <w:szCs w:val="16"/>
+              </w:rPr>
+              <w:t xml:space="preserve">B 万人基线</w:t>
+            </w:r>
+          </w:p>
+        </w:tc>
+        <w:tc>
+          <w:tcPr>
+            <w:tcW w:type="dxa" w:w="2160"/>
+            <w:tcMar>
+              <w:top w:type="dxa" w:w="60"/>
+              <w:left w:type="dxa" w:w="110"/>
+              <w:bottom w:type="dxa" w:w="60"/>
+              <w:right w:type="dxa" w:w="110"/>
+            </w:tcMar>
+            <w:vAlign w:val="center"/>
+          </w:tcPr>
+          <w:p>
+            <w:pPr>
+              <w:spacing w:after="0" w:line="270" w:lineRule="auto"/>
+              <w:jc w:val="left"/>
+            </w:pPr>
+            <w:r>
+              <w:rPr>
+                <w:rFonts w:ascii="Arial" w:eastAsia="微软雅黑" w:hAnsi="Arial"/>
+                <w:b w:val="false"/>
+                <w:bCs w:val="false"/>
+                <w:i w:val="false"/>
+                <w:iCs w:val="false"/>
+                <w:color w:val="000000"/>
+                <w:sz w:val="16"/>
+                <w:szCs w:val="16"/>
+              </w:rPr>
+              <w:t xml:space="preserve">9,900 观众 + 100 出价者</w:t>
+            </w:r>
+          </w:p>
+        </w:tc>
+        <w:tc>
+          <w:tcPr>
+            <w:tcW w:type="dxa" w:w="1400"/>
+            <w:tcMar>
+              <w:top w:type="dxa" w:w="60"/>
+              <w:left w:type="dxa" w:w="110"/>
+              <w:bottom w:type="dxa" w:w="60"/>
+              <w:right w:type="dxa" w:w="110"/>
+            </w:tcMar>
+            <w:vAlign w:val="center"/>
+          </w:tcPr>
+          <w:p>
+            <w:pPr>
+              <w:spacing w:after="0" w:line="270" w:lineRule="auto"/>
+              <w:jc w:val="left"/>
+            </w:pPr>
+            <w:r>
+              <w:rPr>
+                <w:rFonts w:ascii="Arial" w:eastAsia="微软雅黑" w:hAnsi="Arial"/>
+                <w:b w:val="false"/>
+                <w:bCs w:val="false"/>
+                <w:i w:val="false"/>
+                <w:iCs w:val="false"/>
+                <w:color w:val="000000"/>
+                <w:sz w:val="16"/>
+                <w:szCs w:val="16"/>
+              </w:rPr>
+              <w:t xml:space="preserve">约 500 / 秒</w:t>
+            </w:r>
+          </w:p>
+        </w:tc>
+        <w:tc>
+          <w:tcPr>
+            <w:tcW w:type="dxa" w:w="1100"/>
+            <w:tcMar>
+              <w:top w:type="dxa" w:w="60"/>
+              <w:left w:type="dxa" w:w="110"/>
+              <w:bottom w:type="dxa" w:w="60"/>
+              <w:right w:type="dxa" w:w="110"/>
+            </w:tcMar>
+            <w:vAlign w:val="center"/>
+          </w:tcPr>
+          <w:p>
+            <w:pPr>
+              <w:spacing w:after="0" w:line="270" w:lineRule="auto"/>
+              <w:jc w:val="left"/>
+            </w:pPr>
+            <w:r>
+              <w:rPr>
+                <w:rFonts w:ascii="Arial" w:eastAsia="微软雅黑" w:hAnsi="Arial"/>
+                <w:b w:val="false"/>
+                <w:bCs w:val="false"/>
+                <w:i w:val="false"/>
+                <w:iCs w:val="false"/>
+                <w:color w:val="000000"/>
+                <w:sz w:val="16"/>
+                <w:szCs w:val="16"/>
+              </w:rPr>
+              <w:t xml:space="preserve">10,000</w:t>
+            </w:r>
+          </w:p>
+        </w:tc>
+        <w:tc>
+          <w:tcPr>
+            <w:tcW w:type="dxa" w:w="1000"/>
+            <w:tcMar>
+              <w:top w:type="dxa" w:w="60"/>
+              <w:left w:type="dxa" w:w="110"/>
+              <w:bottom w:type="dxa" w:w="60"/>
+              <w:right w:type="dxa" w:w="110"/>
+            </w:tcMar>
+            <w:vAlign w:val="center"/>
+          </w:tcPr>
+          <w:p>
+            <w:pPr>
+              <w:spacing w:after="0" w:line="270" w:lineRule="auto"/>
+              <w:jc w:val="left"/>
+            </w:pPr>
+            <w:r>
+              <w:rPr>
+                <w:rFonts w:ascii="Arial" w:eastAsia="微软雅黑" w:hAnsi="Arial"/>
+                <w:b w:val="false"/>
+                <w:bCs w:val="false"/>
+                <w:i w:val="false"/>
+                <w:iCs w:val="false"/>
+                <w:color w:val="000000"/>
+                <w:sz w:val="16"/>
+                <w:szCs w:val="16"/>
+              </w:rPr>
+              <w:t xml:space="preserve">0.46 ms</w:t>
+            </w:r>
+          </w:p>
+        </w:tc>
+        <w:tc>
+          <w:tcPr>
+            <w:tcW w:type="dxa" w:w="1100"/>
+            <w:tcMar>
+              <w:top w:type="dxa" w:w="60"/>
+              <w:left w:type="dxa" w:w="110"/>
+              <w:bottom w:type="dxa" w:w="60"/>
+              <w:right w:type="dxa" w:w="110"/>
+            </w:tcMar>
+            <w:vAlign w:val="center"/>
+          </w:tcPr>
+          <w:p>
+            <w:pPr>
+              <w:spacing w:after="0" w:line="270" w:lineRule="auto"/>
+              <w:jc w:val="left"/>
+            </w:pPr>
+            <w:r>
+              <w:rPr>
+                <w:rFonts w:ascii="Arial" w:eastAsia="微软雅黑" w:hAnsi="Arial"/>
+                <w:b w:val="false"/>
+                <w:bCs w:val="false"/>
+                <w:i w:val="false"/>
+                <w:iCs w:val="false"/>
+                <w:color w:val="000000"/>
+                <w:sz w:val="16"/>
+                <w:szCs w:val="16"/>
+              </w:rPr>
+              <w:t xml:space="preserve">73 ms</w:t>
+            </w:r>
+          </w:p>
+        </w:tc>
+        <w:tc>
+          <w:tcPr>
+            <w:tcW w:type="dxa" w:w="1100"/>
+            <w:tcMar>
+              <w:top w:type="dxa" w:w="60"/>
+              <w:left w:type="dxa" w:w="110"/>
+              <w:bottom w:type="dxa" w:w="60"/>
+              <w:right w:type="dxa" w:w="110"/>
+            </w:tcMar>
+            <w:vAlign w:val="center"/>
+          </w:tcPr>
+          <w:p>
+            <w:pPr>
+              <w:spacing w:after="0" w:line="270" w:lineRule="auto"/>
+              <w:jc w:val="left"/>
+            </w:pPr>
+            <w:r>
+              <w:rPr>
+                <w:rFonts w:ascii="Arial" w:eastAsia="微软雅黑" w:hAnsi="Arial"/>
+                <w:b w:val="false"/>
+                <w:bCs w:val="false"/>
+                <w:i w:val="false"/>
+                <w:iCs w:val="false"/>
+                <w:color w:val="000000"/>
+                <w:sz w:val="16"/>
+                <w:szCs w:val="16"/>
+              </w:rPr>
+              <w:t xml:space="preserve">干净成交，零早退</w:t>
+            </w:r>
+          </w:p>
+        </w:tc>
+      </w:tr>
+      <w:tr>
+        <w:trPr>
+          <w:tblHeader w:val="false"/>
+        </w:trPr>
+        <w:tc>
+          <w:tcPr>
+            <w:tcW w:type="dxa" w:w="1500"/>
+            <w:shd w:fill="EAF0FA" w:color="auto" w:val="clear"/>
+            <w:tcMar>
+              <w:top w:type="dxa" w:w="60"/>
+              <w:left w:type="dxa" w:w="110"/>
+              <w:bottom w:type="dxa" w:w="60"/>
+              <w:right w:type="dxa" w:w="110"/>
+            </w:tcMar>
+            <w:vAlign w:val="center"/>
+          </w:tcPr>
+          <w:p>
+            <w:pPr>
+              <w:spacing w:after="0" w:line="270" w:lineRule="auto"/>
+              <w:jc w:val="left"/>
+            </w:pPr>
+            <w:r>
+              <w:rPr>
+                <w:rFonts w:ascii="Arial" w:eastAsia="微软雅黑" w:hAnsi="Arial"/>
+                <w:b/>
+                <w:bCs/>
+                <w:i w:val="false"/>
+                <w:iCs w:val="false"/>
+                <w:color w:val="000000"/>
+                <w:sz w:val="16"/>
+                <w:szCs w:val="16"/>
+              </w:rPr>
+              <w:t xml:space="preserve">C 万人高活跃</w:t>
+            </w:r>
+          </w:p>
+        </w:tc>
+        <w:tc>
+          <w:tcPr>
+            <w:tcW w:type="dxa" w:w="2160"/>
+            <w:shd w:fill="EAF0FA" w:color="auto" w:val="clear"/>
+            <w:tcMar>
+              <w:top w:type="dxa" w:w="60"/>
+              <w:left w:type="dxa" w:w="110"/>
+              <w:bottom w:type="dxa" w:w="60"/>
+              <w:right w:type="dxa" w:w="110"/>
+            </w:tcMar>
+            <w:vAlign w:val="center"/>
+          </w:tcPr>
+          <w:p>
+            <w:pPr>
+              <w:spacing w:after="0" w:line="270" w:lineRule="auto"/>
+              <w:jc w:val="left"/>
+            </w:pPr>
+            <w:r>
+              <w:rPr>
+                <w:rFonts w:ascii="Arial" w:eastAsia="微软雅黑" w:hAnsi="Arial"/>
+                <w:b w:val="false"/>
+                <w:bCs w:val="false"/>
+                <w:i w:val="false"/>
+                <w:iCs w:val="false"/>
+                <w:color w:val="000000"/>
+                <w:sz w:val="16"/>
+                <w:szCs w:val="16"/>
+              </w:rPr>
+              <w:t xml:space="preserve">6,000 观众 + 4,000 出价者</w:t>
+            </w:r>
+          </w:p>
+        </w:tc>
+        <w:tc>
+          <w:tcPr>
+            <w:tcW w:type="dxa" w:w="1400"/>
+            <w:shd w:fill="EAF0FA" w:color="auto" w:val="clear"/>
+            <w:tcMar>
+              <w:top w:type="dxa" w:w="60"/>
+              <w:left w:type="dxa" w:w="110"/>
+              <w:bottom w:type="dxa" w:w="60"/>
+              <w:right w:type="dxa" w:w="110"/>
+            </w:tcMar>
+            <w:vAlign w:val="center"/>
+          </w:tcPr>
+          <w:p>
+            <w:pPr>
+              <w:spacing w:after="0" w:line="270" w:lineRule="auto"/>
+              <w:jc w:val="left"/>
+            </w:pPr>
+            <w:r>
+              <w:rPr>
+                <w:rFonts w:ascii="Arial" w:eastAsia="微软雅黑" w:hAnsi="Arial"/>
+                <w:b w:val="false"/>
+                <w:bCs w:val="false"/>
+                <w:i w:val="false"/>
+                <w:iCs w:val="false"/>
+                <w:color w:val="000000"/>
+                <w:sz w:val="16"/>
+                <w:szCs w:val="16"/>
+              </w:rPr>
+              <w:t xml:space="preserve">约 20,000 / 秒</w:t>
+            </w:r>
+          </w:p>
+        </w:tc>
+        <w:tc>
+          <w:tcPr>
+            <w:tcW w:type="dxa" w:w="1100"/>
+            <w:shd w:fill="EAF0FA" w:color="auto" w:val="clear"/>
+            <w:tcMar>
+              <w:top w:type="dxa" w:w="60"/>
+              <w:left w:type="dxa" w:w="110"/>
+              <w:bottom w:type="dxa" w:w="60"/>
+              <w:right w:type="dxa" w:w="110"/>
+            </w:tcMar>
+            <w:vAlign w:val="center"/>
+          </w:tcPr>
+          <w:p>
+            <w:pPr>
+              <w:spacing w:after="0" w:line="270" w:lineRule="auto"/>
+              <w:jc w:val="left"/>
+            </w:pPr>
+            <w:r>
+              <w:rPr>
+                <w:rFonts w:ascii="Arial" w:eastAsia="微软雅黑" w:hAnsi="Arial"/>
+                <w:b w:val="false"/>
+                <w:bCs w:val="false"/>
+                <w:i w:val="false"/>
+                <w:iCs w:val="false"/>
+                <w:color w:val="000000"/>
+                <w:sz w:val="16"/>
+                <w:szCs w:val="16"/>
+              </w:rPr>
+              <w:t xml:space="preserve">10,000</w:t>
+            </w:r>
+          </w:p>
+        </w:tc>
+        <w:tc>
+          <w:tcPr>
+            <w:tcW w:type="dxa" w:w="1000"/>
+            <w:shd w:fill="EAF0FA" w:color="auto" w:val="clear"/>
+            <w:tcMar>
+              <w:top w:type="dxa" w:w="60"/>
+              <w:left w:type="dxa" w:w="110"/>
+              <w:bottom w:type="dxa" w:w="60"/>
+              <w:right w:type="dxa" w:w="110"/>
+            </w:tcMar>
+            <w:vAlign w:val="center"/>
+          </w:tcPr>
+          <w:p>
+            <w:pPr>
+              <w:spacing w:after="0" w:line="270" w:lineRule="auto"/>
+              <w:jc w:val="left"/>
+            </w:pPr>
+            <w:r>
+              <w:rPr>
+                <w:rFonts w:ascii="Arial" w:eastAsia="微软雅黑" w:hAnsi="Arial"/>
+                <w:b w:val="false"/>
+                <w:bCs w:val="false"/>
+                <w:i w:val="false"/>
+                <w:iCs w:val="false"/>
+                <w:color w:val="000000"/>
+                <w:sz w:val="16"/>
+                <w:szCs w:val="16"/>
+              </w:rPr>
+              <w:t xml:space="preserve">3.5 ms</w:t>
+            </w:r>
+          </w:p>
+        </w:tc>
+        <w:tc>
+          <w:tcPr>
+            <w:tcW w:type="dxa" w:w="1100"/>
+            <w:shd w:fill="EAF0FA" w:color="auto" w:val="clear"/>
+            <w:tcMar>
+              <w:top w:type="dxa" w:w="60"/>
+              <w:left w:type="dxa" w:w="110"/>
+              <w:bottom w:type="dxa" w:w="60"/>
+              <w:right w:type="dxa" w:w="110"/>
+            </w:tcMar>
+            <w:vAlign w:val="center"/>
+          </w:tcPr>
+          <w:p>
+            <w:pPr>
+              <w:spacing w:after="0" w:line="270" w:lineRule="auto"/>
+              <w:jc w:val="left"/>
+            </w:pPr>
+            <w:r>
+              <w:rPr>
+                <w:rFonts w:ascii="Arial" w:eastAsia="微软雅黑" w:hAnsi="Arial"/>
+                <w:b w:val="false"/>
+                <w:bCs w:val="false"/>
+                <w:i w:val="false"/>
+                <w:iCs w:val="false"/>
+                <w:color w:val="000000"/>
+                <w:sz w:val="16"/>
+                <w:szCs w:val="16"/>
+              </w:rPr>
+              <w:t xml:space="preserve">58 ms</w:t>
+            </w:r>
+          </w:p>
+        </w:tc>
+        <w:tc>
+          <w:tcPr>
+            <w:tcW w:type="dxa" w:w="1100"/>
+            <w:shd w:fill="EAF0FA" w:color="auto" w:val="clear"/>
+            <w:tcMar>
+              <w:top w:type="dxa" w:w="60"/>
+              <w:left w:type="dxa" w:w="110"/>
+              <w:bottom w:type="dxa" w:w="60"/>
+              <w:right w:type="dxa" w:w="110"/>
+            </w:tcMar>
+            <w:vAlign w:val="center"/>
+          </w:tcPr>
+          <w:p>
+            <w:pPr>
+              <w:spacing w:after="0" w:line="270" w:lineRule="auto"/>
+              <w:jc w:val="left"/>
+            </w:pPr>
+            <w:r>
+              <w:rPr>
+                <w:rFonts w:ascii="Arial" w:eastAsia="微软雅黑" w:hAnsi="Arial"/>
+                <w:b w:val="false"/>
+                <w:bCs w:val="false"/>
+                <w:i w:val="false"/>
+                <w:iCs w:val="false"/>
+                <w:color w:val="000000"/>
+                <w:sz w:val="16"/>
+                <w:szCs w:val="16"/>
+              </w:rPr>
+              <w:t xml:space="preserve">SLO 达标，1.3% 早退</w:t>
+            </w:r>
+          </w:p>
+        </w:tc>
+      </w:tr>
+      <w:tr>
+        <w:trPr>
+          <w:tblHeader w:val="false"/>
+        </w:trPr>
+        <w:tc>
+          <w:tcPr>
+            <w:tcW w:type="dxa" w:w="1500"/>
+            <w:tcMar>
+              <w:top w:type="dxa" w:w="60"/>
+              <w:left w:type="dxa" w:w="110"/>
+              <w:bottom w:type="dxa" w:w="60"/>
+              <w:right w:type="dxa" w:w="110"/>
+            </w:tcMar>
+            <w:vAlign w:val="center"/>
+          </w:tcPr>
+          <w:p>
+            <w:pPr>
+              <w:spacing w:after="0" w:line="270" w:lineRule="auto"/>
+              <w:jc w:val="left"/>
+            </w:pPr>
+            <w:r>
+              <w:rPr>
+                <w:rFonts w:ascii="Arial" w:eastAsia="微软雅黑" w:hAnsi="Arial"/>
+                <w:b/>
+                <w:bCs/>
+                <w:i w:val="false"/>
+                <w:iCs w:val="false"/>
+                <w:color w:val="000000"/>
+                <w:sz w:val="16"/>
+                <w:szCs w:val="16"/>
+              </w:rPr>
+              <w:t xml:space="preserve">D 两万风暴</w:t>
+            </w:r>
+          </w:p>
+        </w:tc>
+        <w:tc>
+          <w:tcPr>
+            <w:tcW w:type="dxa" w:w="2160"/>
+            <w:tcMar>
+              <w:top w:type="dxa" w:w="60"/>
+              <w:left w:type="dxa" w:w="110"/>
+              <w:bottom w:type="dxa" w:w="60"/>
+              <w:right w:type="dxa" w:w="110"/>
+            </w:tcMar>
+            <w:vAlign w:val="center"/>
+          </w:tcPr>
+          <w:p>
+            <w:pPr>
+              <w:spacing w:after="0" w:line="270" w:lineRule="auto"/>
+              <w:jc w:val="left"/>
+            </w:pPr>
+            <w:r>
+              <w:rPr>
+                <w:rFonts w:ascii="Arial" w:eastAsia="微软雅黑" w:hAnsi="Arial"/>
+                <w:b w:val="false"/>
+                <w:bCs w:val="false"/>
+                <w:i w:val="false"/>
+                <w:iCs w:val="false"/>
+                <w:color w:val="000000"/>
+                <w:sz w:val="16"/>
+                <w:szCs w:val="16"/>
+              </w:rPr>
+              <w:t xml:space="preserve">10,000 观众 + 10,000 出价者</w:t>
+            </w:r>
+          </w:p>
+        </w:tc>
+        <w:tc>
+          <w:tcPr>
+            <w:tcW w:type="dxa" w:w="1400"/>
+            <w:tcMar>
+              <w:top w:type="dxa" w:w="60"/>
+              <w:left w:type="dxa" w:w="110"/>
+              <w:bottom w:type="dxa" w:w="60"/>
+              <w:right w:type="dxa" w:w="110"/>
+            </w:tcMar>
+            <w:vAlign w:val="center"/>
+          </w:tcPr>
+          <w:p>
+            <w:pPr>
+              <w:spacing w:after="0" w:line="270" w:lineRule="auto"/>
+              <w:jc w:val="left"/>
+            </w:pPr>
+            <w:r>
+              <w:rPr>
+                <w:rFonts w:ascii="Arial" w:eastAsia="微软雅黑" w:hAnsi="Arial"/>
+                <w:b w:val="false"/>
+                <w:bCs w:val="false"/>
+                <w:i w:val="false"/>
+                <w:iCs w:val="false"/>
+                <w:color w:val="000000"/>
+                <w:sz w:val="16"/>
+                <w:szCs w:val="16"/>
+              </w:rPr>
+              <w:t xml:space="preserve">约 50,000 / 秒</w:t>
+            </w:r>
+          </w:p>
+        </w:tc>
+        <w:tc>
+          <w:tcPr>
+            <w:tcW w:type="dxa" w:w="1100"/>
+            <w:tcMar>
+              <w:top w:type="dxa" w:w="60"/>
+              <w:left w:type="dxa" w:w="110"/>
+              <w:bottom w:type="dxa" w:w="60"/>
+              <w:right w:type="dxa" w:w="110"/>
+            </w:tcMar>
+            <w:vAlign w:val="center"/>
+          </w:tcPr>
+          <w:p>
+            <w:pPr>
+              <w:spacing w:after="0" w:line="270" w:lineRule="auto"/>
+              <w:jc w:val="left"/>
+            </w:pPr>
+            <w:r>
+              <w:rPr>
+                <w:rFonts w:ascii="Arial" w:eastAsia="微软雅黑" w:hAnsi="Arial"/>
+                <w:b w:val="false"/>
+                <w:bCs w:val="false"/>
+                <w:i w:val="false"/>
+                <w:iCs w:val="false"/>
+                <w:color w:val="000000"/>
+                <w:sz w:val="16"/>
+                <w:szCs w:val="16"/>
+              </w:rPr>
+              <w:t xml:space="preserve">15,777</w:t>
+            </w:r>
+          </w:p>
+        </w:tc>
+        <w:tc>
+          <w:tcPr>
+            <w:tcW w:type="dxa" w:w="1000"/>
+            <w:tcMar>
+              <w:top w:type="dxa" w:w="60"/>
+              <w:left w:type="dxa" w:w="110"/>
+              <w:bottom w:type="dxa" w:w="60"/>
+              <w:right w:type="dxa" w:w="110"/>
+            </w:tcMar>
+            <w:vAlign w:val="center"/>
+          </w:tcPr>
+          <w:p>
+            <w:pPr>
+              <w:spacing w:after="0" w:line="270" w:lineRule="auto"/>
+              <w:jc w:val="left"/>
+            </w:pPr>
+            <w:r>
+              <w:rPr>
+                <w:rFonts w:ascii="Arial" w:eastAsia="微软雅黑" w:hAnsi="Arial"/>
+                <w:b w:val="false"/>
+                <w:bCs w:val="false"/>
+                <w:i w:val="false"/>
+                <w:iCs w:val="false"/>
+                <w:color w:val="000000"/>
+                <w:sz w:val="16"/>
+                <w:szCs w:val="16"/>
+              </w:rPr>
+              <w:t xml:space="preserve">约 110 ms 峰</w:t>
+            </w:r>
+          </w:p>
+        </w:tc>
+        <w:tc>
+          <w:tcPr>
+            <w:tcW w:type="dxa" w:w="1100"/>
+            <w:tcMar>
+              <w:top w:type="dxa" w:w="60"/>
+              <w:left w:type="dxa" w:w="110"/>
+              <w:bottom w:type="dxa" w:w="60"/>
+              <w:right w:type="dxa" w:w="110"/>
+            </w:tcMar>
+            <w:vAlign w:val="center"/>
+          </w:tcPr>
+          <w:p>
+            <w:pPr>
+              <w:spacing w:after="0" w:line="270" w:lineRule="auto"/>
+              <w:jc w:val="left"/>
+            </w:pPr>
+            <w:r>
+              <w:rPr>
+                <w:rFonts w:ascii="Arial" w:eastAsia="微软雅黑" w:hAnsi="Arial"/>
+                <w:b w:val="false"/>
+                <w:bCs w:val="false"/>
+                <w:i w:val="false"/>
+                <w:iCs w:val="false"/>
+                <w:color w:val="000000"/>
+                <w:sz w:val="16"/>
+                <w:szCs w:val="16"/>
+              </w:rPr>
+              <w:t xml:space="preserve">73 ms</w:t>
+            </w:r>
+          </w:p>
+        </w:tc>
+        <w:tc>
+          <w:tcPr>
+            <w:tcW w:type="dxa" w:w="1100"/>
+            <w:tcMar>
+              <w:top w:type="dxa" w:w="60"/>
+              <w:left w:type="dxa" w:w="110"/>
+              <w:bottom w:type="dxa" w:w="60"/>
+              <w:right w:type="dxa" w:w="110"/>
+            </w:tcMar>
+            <w:vAlign w:val="center"/>
+          </w:tcPr>
+          <w:p>
+            <w:pPr>
+              <w:spacing w:after="0" w:line="270" w:lineRule="auto"/>
+              <w:jc w:val="left"/>
+            </w:pPr>
+            <w:r>
+              <w:rPr>
+                <w:rFonts w:ascii="Arial" w:eastAsia="微软雅黑" w:hAnsi="Arial"/>
+                <w:b w:val="false"/>
+                <w:bCs w:val="false"/>
+                <w:i w:val="false"/>
+                <w:iCs w:val="false"/>
+                <w:color w:val="000000"/>
+                <w:sz w:val="16"/>
+                <w:szCs w:val="16"/>
+              </w:rPr>
+              <w:t xml:space="preserve">崩溃自恢复，正确性不破</w:t>
+            </w:r>
+          </w:p>
+        </w:tc>
+      </w:tr>
+    </w:tbl>
+    <w:p>
+      <w:pPr>
+        <w:spacing w:after="160" w:before="60"/>
+        <w:jc w:val="center"/>
+      </w:pPr>
+      <w:r>
+        <w:rPr>
+          <w:rFonts w:ascii="Arial" w:eastAsia="微软雅黑" w:hAnsi="Arial"/>
+          <w:b w:val="false"/>
+          <w:bCs w:val="false"/>
+          <w:i/>
+          <w:iCs/>
+          <w:color w:val="595959"/>
+          <w:sz w:val="18"/>
+          <w:szCs w:val="18"/>
+        </w:rPr>
+        <w:t xml:space="preserve">表 14-2　真公网三场景实测汇总（序号空洞与背压强制关闭在三场景中均为零）</w:t>
       </w:r>
     </w:p>
     <w:p>
@@ -10701,7 +11425,7 @@
           <w:sz w:val="18"/>
           <w:szCs w:val="18"/>
         </w:rPr>
-        <w:t xml:space="preserve">表 14-2　AI 旁路失败兜底矩阵</w:t>
+        <w:t xml:space="preserve">表 14-3　AI 旁路失败兜底矩阵</w:t>
       </w:r>
     </w:p>
     <w:p>
@@ -11674,7 +12398,7 @@
           <w:sz w:val="18"/>
           <w:szCs w:val="18"/>
         </w:rPr>
-        <w:t xml:space="preserve">表 14-3　五个混沌演练及其通过判定</w:t>
+        <w:t xml:space="preserve">表 14-4　五个混沌演练及其通过判定</w:t>
       </w:r>
     </w:p>
     <w:p>
@@ -12416,7 +13140,7 @@
                 <w:sz w:val="19"/>
                 <w:szCs w:val="19"/>
               </w:rPr>
-              <w:t xml:space="preserve">14.1（真公网万人 0.46 ms，序号空洞为零）+ 12.4 三方一致回放与哈希链</w:t>
+              <w:t xml:space="preserve">14.1 B（真公网万人 0.46 ms）+ 14.1 C（高活跃 4:6，ack p95 3.5 ms，99.97% fast-reject）+ 14.1 D（容量边界 + 已转化工程任务 #235 / #242）+ 12.4 三方一致回放与哈希链</w:t>
             </w:r>
           </w:p>
         </w:tc>
@@ -14831,7 +15555,7 @@
                 <w:sz w:val="19"/>
                 <w:szCs w:val="19"/>
               </w:rPr>
-              <w:t xml:space="preserve">真公网一万连接，为加分项基线（千人）的十倍（14.1 B）</w:t>
+              <w:t xml:space="preserve">真公网一万连接，为加分项基线（千人）的十倍；四千名活跃出价者同时狂点出价时 ack p95 仍稳 3.5 ms，为挑战二「百人同时狂点」基础要求的四十倍压力且预算富余约二十三倍（14.1 B / C）</w:t>
             </w:r>
           </w:p>
         </w:tc>
@@ -14898,7 +15622,7 @@
                 <w:sz w:val="19"/>
                 <w:szCs w:val="19"/>
               </w:rPr>
-              <w:t xml:space="preserve">峰值约 15,777 连接、目标每秒五万笔时崩溃的边界如实呈现（14.1 C）</w:t>
+              <w:t xml:space="preserve">峰值约 15,777 连接、目标每秒五万笔时崩溃的边界如实呈现，并已转化为 #235 优雅降载与 #242 panic 兜底（14.1 D）</w:t>
             </w:r>
           </w:p>
         </w:tc>
@@ -14967,7 +15691,7 @@
                 <w:sz w:val="19"/>
                 <w:szCs w:val="19"/>
               </w:rPr>
-              <w:t xml:space="preserve">评委导演模式 /showcase、可展开的工程信息条与剧场化首页，使工程可信度成为评委可见的界面元素（13.3 末段）</w:t>
+              <w:t xml:space="preserve">演示入口两端同框（手机框 + 浏览器框）、均复用生产组件，配合可展开的工程信息条，使工程可信度成为评委可见的界面元素（13.3 末段 + §6）</w:t>
             </w:r>
           </w:p>
         </w:tc>
@@ -15954,7 +16678,7 @@
           <w:sz w:val="22"/>
           <w:szCs w:val="22"/>
         </w:rPr>
-        <w:t xml:space="preserve">：应用层单房间一万连接已在真公网干净达标；单网关在目标每秒约五万笔出价、峰值约一万五千七百七十七（15,777）连接时进程会崩溃重启，但正确性始终不破。这是边界发现而非达标项，后续进入准入控制与多网关扇出路线。</w:t>
+        <w:t xml:space="preserve">：应用层单房间一万连接已在真公网干净达标（含四千活跃出价者的高活跃场景）；单网关在目标每秒约五万笔出价、峰值约一万五千七百七十七（15,777）连接时进程会崩溃重启，但正确性始终不破。这是边界发现而非达标项，且已转化为工程任务——准入控制与单连接内存削减已在 PR #235 合入主分支，请求生命周期外 goroutine 的 panic 兜底（PR #242）待合，多网关扇出仍在后续路线。</w:t>
       </w:r>
     </w:p>
     <w:p>
@@ -16102,7 +16826,7 @@
           <w:sz w:val="22"/>
           <w:szCs w:val="22"/>
         </w:rPr>
-        <w:t xml:space="preserve">：本报告所有性能数字均在火山引擎北京 ECS（4 核 8 GiB）单进程裸二进制下采集；多网关并行扇出、跨地域副本与企业级专线链路未在本作品范围内验证。其中私网内一万并发（Tier-1）有完整的一键复现手册 `docs/runbooks/beijing-tier1-10k-demo.md`，含跳板、压测机配置、令牌分片与运行命令；异地公网压测机打向北京网关弹性 IP 的真公网一万并发（Tier-2）与两万容量边界，其拓扑与数据见 issue #233，独立复现手册列为后续工作。</w:t>
+        <w:t xml:space="preserve">：本报告所有性能数字均在火山引擎北京 ECS（4 核 8 GiB）单进程裸二进制下采集；多网关并行扇出、跨地域副本与企业级专线链路未在本作品范围内验证。其中私网内一万并发（Tier-1）有完整的一键复现手册 `docs/runbooks/beijing-tier1-10k-demo.md`，含跳板、压测机配置、令牌分片与运行命令；异地公网压测机打向北京网关弹性 IP 的真公网三场景（万人基线 / 万人高活跃 / 两万风暴）拓扑与数据，详见仓库性能报告 `docs/reports/2026-06-07-tier2-public-loadtest-10k-20k.md` 与 issue #233，公网拓扑的独立一键 runbook 列为后续工作。</w:t>
       </w:r>
     </w:p>
     <w:p>
@@ -16164,7 +16888,7 @@
           <w:sz w:val="22"/>
           <w:szCs w:val="22"/>
         </w:rPr>
-        <w:t xml:space="preserve">打开生产入口与版本接口，确认部署身份新鲜、协议版本与构建标识一致（约半分钟）。</w:t>
+        <w:t xml:space="preserve">打开版本接口 `http://115.191.76.40/version`，确认部署身份新鲜——返回的协议版本、构建提交号与构建时间应与期望值一致，借此核对线上运行的正是持续集成验证过的二进制（约半分钟）。</w:t>
       </w:r>
     </w:p>
     <w:p>
@@ -16188,7 +16912,7 @@
           <w:sz w:val="22"/>
           <w:szCs w:val="22"/>
         </w:rPr>
-        <w:t xml:space="preserve">打开评委导演模式（若当天已部署则为 `/showcase`，否则用首页加直播间组合，本地一键启动后亦可访问），以六步走完拍卖闭环，观察双手机视角、反狙横幅、工程信息条与证据卡（约两分钟）。</w:t>
+        <w:t xml:space="preserve">打开演示入口 `http://115.191.76.40/`（手机框与浏览器框两端同框），走一遍拍卖闭环，观察两端视角、反狙横幅、工程信息条与证据卡；买家端也可直接用手机访问 `/#/m` 体验（约两分钟）。</w:t>
       </w:r>
     </w:p>
     <w:p>
@@ -16284,7 +17008,7 @@
           <w:sz w:val="22"/>
           <w:szCs w:val="22"/>
         </w:rPr>
-        <w:t xml:space="preserve">查阅 issue #233 的真公网 Tier-2 实测摘要（十千基线 / 十千四比六 / 两万风暴三场景）与 #231（公网万人达标，已关闭），核对万人数据与容量边界的诚实声明（约一分钟）。</w:t>
+        <w:t xml:space="preserve">查阅仓库性能报告 `docs/reports/2026-06-07-tier2-public-loadtest-10k-20k.md`（issue #233 / #231 跟踪），核对真公网三场景（万人基线 0.46 ms、万人高活跃 3.5 ms、两万风暴容量边界）与诚实声明的早退口径（约一分钟）。</w:t>
       </w:r>
     </w:p>
     <w:sectPr>

</xml_diff>